<commit_message>
plateau: redesign, logo, research and family spaces, live accounts
</commit_message>
<xml_diff>
--- a/paper/Research_Paper_EN.docx
+++ b/paper/Research_Paper_EN.docx
@@ -806,7 +806,7 @@
         <w:ind w:firstLine="567"/>
       </w:pPr>
       <w:r>
-        <w:t>The replacement has two parts, both served from the project repository on GitHub Pages. The cohort explorer is a single page that shows Kaplan-Meier curves by age band, with confidence bands, for each of the four individual-patient cohorts, together with the forest plot of the meta-analysis, in English and Russian. It never draws a group of fewer than 10 patients. The platform is a browser application for students and researchers who have a cohort of their own. The user loads a spreadsheet, maps its columns to a standard field list, and the application checks the file, warns about columns that look like names, dates or identifiers, converts survival times to months, and then runs the same analyses as this paper: Kaplan-Meier curves, the log-rank test, the nested Cox models, the Schoenfeld test and a written methods paragraph. It then places the user's age hazard ratio on a forest plot next to the four reference cohorts and pools them. Everything runs in the browser. No patient row is transmitted. A user who wishes to can share a summary of their cohort, which contains counts, medians and model coefficients only, with age-band counts below 10 removed; an administrator reviews it before it joins the pool, and the pooled estimate then updates for everyone. The application also holds researcher profiles with topic tags and a moderated discussion thread per dataset.</w:t>
+        <w:t>The replacement is a web application called plateau, after the flat tail of a survival curve where the long-term survivors are, served from the project repository on GitHub Pages in English and Russian. Its Explore section shows Kaplan-Meier curves by age band, with confidence bands, for each of the four individual-patient cohorts, together with the forest plot of the meta-analysis. It never draws a group of fewer than 10 patients. Its Analyse section is for students and researchers who have a cohort of their own. The user loads a spreadsheet, maps its columns to a standard field list, and the application checks the file, warns about columns that look like names, dates or identifiers, converts survival times to months, and then runs the same analyses as this paper: Kaplan-Meier curves, the log-rank test, the nested Cox models, the Schoenfeld test and a written methods paragraph. It then places the user's age hazard ratio on a forest plot next to the four reference cohorts and pools them. Everything runs in the browser. No patient row is transmitted. A user who wishes to can share a summary of their cohort, which contains counts, medians and model coefficients only, with age-band counts below 10 removed; an administrator reviews it before it joins the pool, and the pooled estimate then updates for everyone. Around the tools sit two communities that share one sign-in but are kept apart by the database's access rules: a research space with discussion boards per dataset and per method and a directory of researchers, and a family space for patients, caregivers and relatives, whose posts only other family members can read, with a list of verified support organisations. Every new post in either space is read by a moderator before it appears, and the family space does not allow medical advice.</w:t>
       </w:r>
     </w:p>
     <w:p>
@@ -13943,7 +13943,7 @@
         <w:pStyle w:val="Heading2"/>
       </w:pPr>
       <w:r>
-        <w:t>3.13. The cohort explorer and the platform</w:t>
+        <w:t>3.13. The plateau application</w:t>
       </w:r>
     </w:p>
     <w:p>
@@ -13951,7 +13951,7 @@
         <w:ind w:firstLine="567"/>
       </w:pPr>
       <w:r>
-        <w:t>Figure 13 shows the public cohort explorer. The reader picks a cohort and sees its survival curves by age band with confidence bands, a table of patients, deaths, median survival and survival at 12 and 24 months per band, the log-rank p value, and the cohort's age hazard ratio; below that sits the forest plot of Figure 11. The platform's analysis wizard produces, for a user's own file, the same outputs as Sections 3.1 to 3.7 of this paper, and its comparison step reproduces Figure 11 with the user's cohort added. On the demonstration file, a 60-patient cohort simulated with a known hazard ratio of 1.030, the platform estimated 1.022 (95% CI 1.003 to 1.042), which is also what lifelines gives for the same file. Both tools state on their first screen that they show how groups fared in research cohorts and are not for decisions about any person.</w:t>
+        <w:t>Figure 13 shows the Explore section of plateau. The reader picks a cohort and sees its survival curves by age band with confidence bands, a table of patients, deaths, median survival and survival at 12 and 24 months per band, the log-rank p value, and the cohort's age hazard ratio; below that sits the forest plot of Figure 11. The platform's analysis wizard produces, for a user's own file, the same outputs as Sections 3.1 to 3.7 of this paper, and its comparison step reproduces Figure 11 with the user's cohort added. On the demonstration file, a 60-patient cohort simulated with a known hazard ratio of 1.030, the platform estimated 1.022 (95% CI 1.003 to 1.042), which is also what lifelines gives for the same file. Both tools state on their first screen that they show how groups fared in research cohorts and are not for decisions about any person.</w:t>
       </w:r>
     </w:p>
     <w:p>
@@ -13962,7 +13962,7 @@
       <w:r>
         <w:drawing>
           <wp:inline xmlns:a="http://schemas.openxmlformats.org/drawingml/2006/main" xmlns:pic="http://schemas.openxmlformats.org/drawingml/2006/picture">
-            <wp:extent cx="5486400" cy="4286250"/>
+            <wp:extent cx="5486400" cy="3857625"/>
             <wp:docPr id="13" name="Picture 13"/>
             <wp:cNvGraphicFramePr>
               <a:graphicFrameLocks noChangeAspect="1"/>
@@ -13983,7 +13983,7 @@
                   <pic:spPr>
                     <a:xfrm>
                       <a:off x="0" y="0"/>
-                      <a:ext cx="5486400" cy="4286250"/>
+                      <a:ext cx="5486400" cy="3857625"/>
                     </a:xfrm>
                     <a:prstGeom prst="rect"/>
                   </pic:spPr>
@@ -14004,7 +14004,7 @@
           <w:i/>
           <w:sz w:val="22"/>
         </w:rPr>
-        <w:t>Figure 13. The cohort explorer: cohort choice and description on the left, Kaplan-Meier curves by age band with their table on the right. The interface is available in English and Russian.</w:t>
+        <w:t>Figure 13. The plateau home page. The same site holds the Explore, Analyse and Pool tools and the two moderated communities, in English and Russian.</w:t>
       </w:r>
     </w:p>
     <w:p>
@@ -21765,7 +21765,7 @@
         <w:pStyle w:val="Heading2"/>
       </w:pPr>
       <w:r>
-        <w:t>Appendix D. The cohort explorer and the platform</w:t>
+        <w:t>Appendix D. The plateau application</w:t>
       </w:r>
     </w:p>
     <w:p>
@@ -21773,7 +21773,7 @@
         <w:ind w:firstLine="567"/>
       </w:pPr>
       <w:r>
-        <w:t>The explorer is docs/index.html in the repository and is served at nnnnshsjsjsj.github.io/gbm-age-survival. It is one file with the group-level curves of all four cohorts embedded; it makes no network requests apart from the fonts and stores nothing about the visitor except the chosen language and theme in the browser. The platform is in platform/ and is served from the same site under /platform. It is a React application; its statistics engine (platform/src/engine/) is a set of plain JavaScript modules for the Kaplan-Meier estimator, the log-rank test, Cox regression with Efron tie handling, the Schoenfeld test and random-effects meta-analysis, with tests in platform/tests/ that compare them with lifelines on the four reference cohorts and on simulated data. The optional shared features use a Supabase database whose schema and row-level security rules are in platform/supabase/; the schema stores no field that could hold a patient row, refuses summaries with fewer than 10 patients or 10 deaths, and logs every administrative action. A summary that a user chooses to share contains counts, medians, survival at fixed times and model coefficients with their standard errors, and nothing else.</w:t>
+        <w:t>plateau is served at nnnnshsjsjsj.github.io/gbm-age-survival from the docs/ folder of the repository; its source is in platform/. It is a React application. Its statistics engine (platform/src/engine/) is a set of plain JavaScript modules for the Kaplan-Meier estimator, the log-rank test, Cox regression with Efron tie handling, the Schoenfeld test and random-effects meta-analysis, with tests in platform/tests/ that compare them with lifelines on the four reference cohorts and on simulated data. Accounts and the two communities use a Supabase database hosted in the EU, whose schema and row-level security rules are in platform/supabase/migrations/0002_plateau.sql. The rules let a family post be read only by family members and moderators, let a research account alone share a cohort summary, hold every new post as pending until a moderator approves it, and send every moderation action to an audit log. The database stores no field that could hold a patient row and refuses summaries with fewer than 10 patients or 10 deaths. A summary that a user chooses to share contains counts, medians, survival at fixed times and model coefficients with their standard errors, and nothing else.</w:t>
       </w:r>
     </w:p>
     <w:p>

</xml_diff>

<commit_message>
cohortex: premium dark redesign, new name and logo
</commit_message>
<xml_diff>
--- a/paper/Research_Paper_EN.docx
+++ b/paper/Research_Paper_EN.docx
@@ -806,7 +806,7 @@
         <w:ind w:firstLine="567"/>
       </w:pPr>
       <w:r>
-        <w:t>The replacement is a web application called plateau, after the flat tail of a survival curve where the long-term survivors are, served from the project repository on GitHub Pages in English and Russian. Its Explore section shows Kaplan-Meier curves by age band, with confidence bands, for each of the four individual-patient cohorts, together with the forest plot of the meta-analysis. It never draws a group of fewer than 10 patients. Its Analyse section is for students and researchers who have a cohort of their own. The user loads a spreadsheet, maps its columns to a standard field list, and the application checks the file, warns about columns that look like names, dates or identifiers, converts survival times to months, and then runs the same analyses as this paper: Kaplan-Meier curves, the log-rank test, the nested Cox models, the Schoenfeld test and a written methods paragraph. It then places the user's age hazard ratio on a forest plot next to the four reference cohorts and pools them. Everything runs in the browser. No patient row is transmitted. A user who wishes to can share a summary of their cohort, which contains counts, medians and model coefficients only, with age-band counts below 10 removed; an administrator reviews it before it joins the pool, and the pooled estimate then updates for everyone. Around the tools sit two communities that share one sign-in but are kept apart by the database's access rules: a research space with discussion boards per dataset and per method and a directory of researchers, and a family space for patients, caregivers and relatives, whose posts only other family members can read, with a list of verified support organisations. Every new post in either space is read by a moderator before it appears, and the family space does not allow medical advice.</w:t>
+        <w:t>The replacement is a web application called cohortex (cohort + cortex: many cohorts, one brain tumour), served from the project repository on GitHub Pages in English and Russian. Its Explore section shows Kaplan-Meier curves by age band, with confidence bands, for each of the four individual-patient cohorts, together with the forest plot of the meta-analysis. It never draws a group of fewer than 10 patients. Its Analyse section is for students and researchers who have a cohort of their own. The user loads a spreadsheet, maps its columns to a standard field list, and the application checks the file, warns about columns that look like names, dates or identifiers, converts survival times to months, and then runs the same analyses as this paper: Kaplan-Meier curves, the log-rank test, the nested Cox models, the Schoenfeld test and a written methods paragraph. It then places the user's age hazard ratio on a forest plot next to the four reference cohorts and pools them. Everything runs in the browser. No patient row is transmitted. A user who wishes to can share a summary of their cohort, which contains counts, medians and model coefficients only, with age-band counts below 10 removed; an administrator reviews it before it joins the pool, and the pooled estimate then updates for everyone. Around the tools sit two communities that share one sign-in but are kept apart by the database's access rules: a research space with discussion boards per dataset and per method and a directory of researchers, and a family space for patients, caregivers and relatives, whose posts only other family members can read, with a list of verified support organisations. Every new post in either space is read by a moderator before it appears, and the family space does not allow medical advice.</w:t>
       </w:r>
     </w:p>
     <w:p>
@@ -13943,7 +13943,7 @@
         <w:pStyle w:val="Heading2"/>
       </w:pPr>
       <w:r>
-        <w:t>3.13. The plateau application</w:t>
+        <w:t>3.13. The cohortex application</w:t>
       </w:r>
     </w:p>
     <w:p>
@@ -13951,7 +13951,7 @@
         <w:ind w:firstLine="567"/>
       </w:pPr>
       <w:r>
-        <w:t>Figure 13 shows the Explore section of plateau. The reader picks a cohort and sees its survival curves by age band with confidence bands, a table of patients, deaths, median survival and survival at 12 and 24 months per band, the log-rank p value, and the cohort's age hazard ratio; below that sits the forest plot of Figure 11. The platform's analysis wizard produces, for a user's own file, the same outputs as Sections 3.1 to 3.7 of this paper, and its comparison step reproduces Figure 11 with the user's cohort added. On the demonstration file, a 60-patient cohort simulated with a known hazard ratio of 1.030, the platform estimated 1.022 (95% CI 1.003 to 1.042), which is also what lifelines gives for the same file. Both tools state on their first screen that they show how groups fared in research cohorts and are not for decisions about any person.</w:t>
+        <w:t>Figure 13 shows the Explore section of cohortex. The reader picks a cohort and sees its survival curves by age band with confidence bands, a table of patients, deaths, median survival and survival at 12 and 24 months per band, the log-rank p value, and the cohort's age hazard ratio; below that sits the forest plot of Figure 11. The platform's analysis wizard produces, for a user's own file, the same outputs as Sections 3.1 to 3.7 of this paper, and its comparison step reproduces Figure 11 with the user's cohort added. On the demonstration file, a 60-patient cohort simulated with a known hazard ratio of 1.030, the platform estimated 1.022 (95% CI 1.003 to 1.042), which is also what lifelines gives for the same file. Both tools state on their first screen that they show how groups fared in research cohorts and are not for decisions about any person.</w:t>
       </w:r>
     </w:p>
     <w:p>
@@ -14004,7 +14004,7 @@
           <w:i/>
           <w:sz w:val="22"/>
         </w:rPr>
-        <w:t>Figure 13. The plateau home page. The same site holds the Explore, Analyse and Pool tools and the two moderated communities, in English and Russian.</w:t>
+        <w:t>Figure 13. The cohortex home page. The same site holds the Explore, Analyse and Pool tools and the two moderated communities, in English and Russian.</w:t>
       </w:r>
     </w:p>
     <w:p>
@@ -21765,7 +21765,7 @@
         <w:pStyle w:val="Heading2"/>
       </w:pPr>
       <w:r>
-        <w:t>Appendix D. The plateau application</w:t>
+        <w:t>Appendix D. The cohortex application</w:t>
       </w:r>
     </w:p>
     <w:p>
@@ -21773,7 +21773,7 @@
         <w:ind w:firstLine="567"/>
       </w:pPr>
       <w:r>
-        <w:t>plateau is served at nnnnshsjsjsj.github.io/gbm-age-survival from the docs/ folder of the repository; its source is in platform/. It is a React application. Its statistics engine (platform/src/engine/) is a set of plain JavaScript modules for the Kaplan-Meier estimator, the log-rank test, Cox regression with Efron tie handling, the Schoenfeld test and random-effects meta-analysis, with tests in platform/tests/ that compare them with lifelines on the four reference cohorts and on simulated data. Accounts and the two communities use a Supabase database hosted in the EU, whose schema and row-level security rules are in platform/supabase/migrations/0002_plateau.sql. The rules let a family post be read only by family members and moderators, let a research account alone share a cohort summary, hold every new post as pending until a moderator approves it, and send every moderation action to an audit log. The database stores no field that could hold a patient row and refuses summaries with fewer than 10 patients or 10 deaths. A summary that a user chooses to share contains counts, medians, survival at fixed times and model coefficients with their standard errors, and nothing else.</w:t>
+        <w:t>cohortex is served at nnnnshsjsjsj.github.io/gbm-age-survival from the docs/ folder of the repository; its source is in platform/. It is a React application. Its statistics engine (platform/src/engine/) is a set of plain JavaScript modules for the Kaplan-Meier estimator, the log-rank test, Cox regression with Efron tie handling, the Schoenfeld test and random-effects meta-analysis, with tests in platform/tests/ that compare them with lifelines on the four reference cohorts and on simulated data. Accounts and the two communities use a Supabase database hosted in the EU, whose schema and row-level security rules are in platform/supabase/migrations/0002_plateau.sql. The rules let a family post be read only by family members and moderators, let a research account alone share a cohort summary, hold every new post as pending until a moderator approves it, and send every moderation action to an audit log. The database stores no field that could hold a patient row and refuses summaries with fewer than 10 patients or 10 deaths. A summary that a user chooses to share contains counts, medians, survival at fixed times and model coefficients with their standard errors, and nothing else.</w:t>
       </w:r>
     </w:p>
     <w:p>

</xml_diff>

<commit_message>
cohortex v6: research hub and patients & families guide replace the forums
</commit_message>
<xml_diff>
--- a/paper/Research_Paper_EN.docx
+++ b/paper/Research_Paper_EN.docx
@@ -806,7 +806,7 @@
         <w:ind w:firstLine="567"/>
       </w:pPr>
       <w:r>
-        <w:t>The replacement is a web application called cohortex (cohort + cortex: many cohorts, one brain tumour), served from the project repository on GitHub Pages in English and Russian. Its Explore section shows Kaplan-Meier curves by age band, with confidence bands, for each of the four individual-patient cohorts, together with the forest plot of the meta-analysis. It never draws a group of fewer than 10 patients. Its Analyse section is for students and researchers who have a cohort of their own. The user loads a spreadsheet, maps its columns to a standard field list, and the application checks the file, warns about columns that look like names, dates or identifiers, converts survival times to months, and then runs the same analyses as this paper: Kaplan-Meier curves, the log-rank test, the nested Cox models, the Schoenfeld test and a written methods paragraph. It then places the user's age hazard ratio on a forest plot next to the four reference cohorts and pools them. Everything runs in the browser. No patient row is transmitted. A user who wishes to can share a summary of their cohort, which contains counts, medians and model coefficients only, with age-band counts below 10 removed; an administrator reviews it before it joins the pool, and the pooled estimate then updates for everyone. Around the tools sit two communities that share one sign-in but are kept apart by the database's access rules: a research space with discussion boards per dataset and per method and a directory of researchers, and a family space for patients, caregivers and relatives, whose posts only other family members can read, with a list of verified support organisations. Every new post in either space is read by a moderator before it appears, and the family space does not allow medical advice. The home page tells the study as a scroll-driven story around an interactive 3D model of a brain with a glioblastoma, and a Brain lab page lets the reader turn the model, cut through it and switch its layers on and off: the necrotic core, the enhancing rim, the oedema, and the infiltrating cells coloured by the four Neftel states. The model is generated mathematically in the browser and is an illustration, not a patient scan.</w:t>
+        <w:t>The replacement is a web application called cohortex (cohort + cortex: many cohorts, one brain tumour), served from the project repository on GitHub Pages in English and Russian. Its Explore section shows Kaplan-Meier curves by age band, with confidence bands, for each of the four individual-patient cohorts, together with the forest plot of the meta-analysis. It never draws a group of fewer than 10 patients. Its Analyse section is for students and researchers who have a cohort of their own. The user loads a spreadsheet, maps its columns to a standard field list, and the application checks the file, warns about columns that look like names, dates or identifiers, converts survival times to months, and then runs the same analyses as this paper: Kaplan-Meier curves, the log-rank test, the nested Cox models, the Schoenfeld test and a written methods paragraph. It then places the user's age hazard ratio on a forest plot next to the four reference cohorts and pools them. Everything runs in the browser. No patient row is transmitted. A user who wishes to can download a summary of their cohort, which contains counts, medians and model coefficients only, with age-band counts below 10 removed, and offer it for the pooled analysis through the repository. The site has no accounts and no server of its own. Next to the tools sit two guides. The research hub is for students and researchers new to glioblastoma: five ordered reading paths, a library of 100 papers checked against their DOI and PubMed records with a plain summary of each in English and Russian, 109 datasets, programs, guidelines, trial registries and courses, and small 3D models (the four Neftel cell states with their entropy, and an MRI slice moving through a model head). The guide for patients and families lists helplines, psychological and psycho-oncology services, patient organisations and palliative care in 64 countries, international directories, common questions and reading, each link opened and checked by hand; it gives no medical advice and says nothing about any one person's outlook. The home page tells the study as a scroll-driven story around an interactive 3D model of a brain with a glioblastoma, and a Brain lab page lets the reader turn the model, cut through it and switch its layers on and off: the necrotic core, the enhancing rim, the oedema, and the infiltrating cells coloured by the four Neftel states. The model is generated mathematically in the browser and is an illustration, not a patient scan.</w:t>
       </w:r>
     </w:p>
     <w:p>
@@ -14004,7 +14004,7 @@
           <w:i/>
           <w:sz w:val="22"/>
         </w:rPr>
-        <w:t>Figure 13. The cohortex home page. The same site holds the Explore, Analyse and Pool tools and the two moderated communities, in English and Russian.</w:t>
+        <w:t>Figure 13. The cohortex home page. The same site holds the Explore, Analyse and Pool tools, a research hub for newcomers and a support guide for patients and families, in English and Russian.</w:t>
       </w:r>
     </w:p>
     <w:p>
@@ -14363,7 +14363,7 @@
         <w:ind w:firstLine="567"/>
       </w:pPr>
       <w:r>
-        <w:t>The heterogeneity question deserves a second attempt with better instruments. Deconvolution methods that estimate cell-state proportions from bulk expression using single-cell references would replace our softmax shares with proper estimates, and the CGGA tumors that have both RNA sequencing and whole-exome data would allow a MATH replication. The age analysis has three natural extensions. A coefficient for age that changes continuously with time would replace the fixed cut at 12 months. A model with left truncation would give MSK-IMPACT an unbiased estimate. And the meta-analysis should grow: the platform is designed so that every cohort a user chooses to share adds a row to Figure 11, and the first outside cohorts will show whether the prediction interval holds. The platform itself needs a usability study with five to eight students, each given the demonstration file and asked to reach the comparison step, measuring time and errors and collecting a System Usability Scale score; that study is planned as the next step of the project. A patient and family space, kept separate from the research platform and moderated by a clinician, is planned after the research side is stable.</w:t>
+        <w:t>The heterogeneity question deserves a second attempt with better instruments. Deconvolution methods that estimate cell-state proportions from bulk expression using single-cell references would replace our softmax shares with proper estimates, and the CGGA tumors that have both RNA sequencing and whole-exome data would allow a MATH replication. The age analysis has three natural extensions. A coefficient for age that changes continuously with time would replace the fixed cut at 12 months. A model with left truncation would give MSK-IMPACT an unbiased estimate. And the meta-analysis should grow: the platform is designed so that every cohort a user chooses to share adds a row to Figure 11, and the first outside cohorts will show whether the prediction interval holds. The platform itself needs a usability study with five to eight students, each given the demonstration file and asked to reach the comparison step, measuring time and errors and collecting a System Usability Scale score; that study is planned as the next step of the project. The support directory needs a fixed review cycle, because helpline numbers and hours change, and a clinician and a psycho-oncologist should read it before it is promoted to patients.</w:t>
       </w:r>
     </w:p>
     <w:p>
@@ -21773,7 +21773,7 @@
         <w:ind w:firstLine="567"/>
       </w:pPr>
       <w:r>
-        <w:t>cohortex is served at nnnnshsjsjsj.github.io/gbm-age-survival from the docs/ folder of the repository; its source is in platform/. It is a React application. Its statistics engine (platform/src/engine/) is a set of plain JavaScript modules for the Kaplan-Meier estimator, the log-rank test, Cox regression with Efron tie handling, the Schoenfeld test and random-effects meta-analysis, with tests in platform/tests/ that compare them with lifelines on the four reference cohorts and on simulated data. Accounts and the two communities use a Supabase database hosted in the EU, whose schema and row-level security rules are in platform/supabase/migrations/0002_plateau.sql. The rules let a family post be read only by family members and moderators, let a research account alone share a cohort summary, hold every new post as pending until a moderator approves it, and send every moderation action to an audit log. The database stores no field that could hold a patient row and refuses summaries with fewer than 10 patients or 10 deaths. A summary that a user chooses to share contains counts, medians, survival at fixed times and model coefficients with their standard errors, and nothing else.</w:t>
+        <w:t>cohortex is served at nnnnshsjsjsj.github.io/gbm-age-survival from the docs/ folder of the repository; its source is in platform/. It is a React application. Its statistics engine (platform/src/engine/) is a set of plain JavaScript modules for the Kaplan-Meier estimator, the log-rank test, Cox regression with Efron tie handling, the Schoenfeld test and random-effects meta-analysis, with tests in platform/tests/ that compare them with lifelines on the four reference cohorts and on simulated data. The site is static: it has no accounts and no database, and the reference cohorts, the research catalogue (public/hub/research.json) and the support directory (public/hub/patients.json) are plain files served with it. A cohort summary is written only to the user's own computer when they click download; it contains counts, medians, survival at fixed times and model coefficients with their standard errors, and nothing else. An earlier version (v5) ran moderated forums on a Supabase database; they were closed in v6 and replaced by the two guides.</w:t>
       </w:r>
     </w:p>
     <w:p>

</xml_diff>